<commit_message>
post service - structure charts
</commit_message>
<xml_diff>
--- a/03_Team_Work/Team1/Milestone_3_Components/Part2/1_In_Progress/DC_M3_Team1_SC_JobPostingService_v1.0.docx
+++ b/03_Team_Work/Team1/Milestone_3_Components/Part2/1_In_Progress/DC_M3_Team1_SC_JobPostingService_v1.0.docx
@@ -120,16 +120,14 @@
         </w:rPr>
         <w:t xml:space="preserve"> </w:t>
       </w:r>
-      <w:proofErr w:type="spellStart"/>
-      <w:r>
-        <w:rPr>
-          <w:rFonts w:ascii="Arial" w:hAnsi="Arial"/>
-          <w:b/>
-          <w:bCs/>
-        </w:rPr>
-        <w:t>theNameOfTheFunctionBeingCharted</w:t>
-      </w:r>
-      <w:proofErr w:type="spellEnd"/>
+      <w:r>
+        <w:rPr>
+          <w:rFonts w:ascii="Arial" w:hAnsi="Arial"/>
+          <w:b/>
+          <w:bCs/>
+        </w:rPr>
+        <w:t>createPost</w:t>
+      </w:r>
       <w:r>
         <w:rPr>
           <w:rFonts w:ascii="Arial" w:hAnsi="Arial"/>
@@ -152,104 +150,63 @@
       <w:pPr>
         <w:rPr>
           <w:rFonts w:ascii="Arial" w:hAnsi="Arial"/>
-          <w:sz w:val="20"/>
-          <w:szCs w:val="20"/>
-        </w:rPr>
-      </w:pPr>
-      <w:r>
-        <w:rPr>
-          <w:rFonts w:ascii="Arial" w:hAnsi="Arial"/>
-          <w:sz w:val="20"/>
-          <w:szCs w:val="20"/>
-        </w:rPr>
-        <w:t xml:space="preserve">&lt;Diagram Goes Here. Load the </w:t>
-      </w:r>
-      <w:proofErr w:type="spellStart"/>
-      <w:r>
-        <w:rPr>
-          <w:rFonts w:ascii="Arial" w:hAnsi="Arial"/>
-          <w:sz w:val="20"/>
-          <w:szCs w:val="20"/>
-        </w:rPr>
-        <w:t>sc</w:t>
-      </w:r>
-      <w:r>
-        <w:rPr>
-          <w:rFonts w:ascii="Arial" w:hAnsi="Arial"/>
-          <w:sz w:val="20"/>
-          <w:szCs w:val="20"/>
-        </w:rPr>
-        <w:t>.drawio</w:t>
-      </w:r>
-      <w:proofErr w:type="spellEnd"/>
-      <w:r>
-        <w:rPr>
-          <w:rFonts w:ascii="Arial" w:hAnsi="Arial"/>
-          <w:sz w:val="20"/>
-          <w:szCs w:val="20"/>
-        </w:rPr>
-        <w:t xml:space="preserve"> file </w:t>
-      </w:r>
-      <w:r>
-        <w:rPr>
-          <w:rFonts w:ascii="Arial" w:hAnsi="Arial"/>
-          <w:sz w:val="20"/>
-          <w:szCs w:val="20"/>
-        </w:rPr>
-        <w:t xml:space="preserve">in the /Reference folder </w:t>
-      </w:r>
-      <w:r>
-        <w:rPr>
-          <w:rFonts w:ascii="Arial" w:hAnsi="Arial"/>
-          <w:sz w:val="20"/>
-          <w:szCs w:val="20"/>
-        </w:rPr>
-        <w:t xml:space="preserve">into </w:t>
-      </w:r>
-      <w:hyperlink r:id="rId4" w:history="1">
-        <w:r>
-          <w:rPr>
-            <w:rStyle w:val="Hyperlink"/>
-            <w:rFonts w:ascii="Arial" w:hAnsi="Arial"/>
-            <w:sz w:val="20"/>
-            <w:szCs w:val="20"/>
-          </w:rPr>
-          <w:t>https://app.diagrams.net/</w:t>
-        </w:r>
-      </w:hyperlink>
-      <w:r>
-        <w:rPr>
-          <w:rFonts w:ascii="Arial" w:hAnsi="Arial"/>
-          <w:sz w:val="20"/>
-          <w:szCs w:val="20"/>
-        </w:rPr>
-        <w:t xml:space="preserve"> to use as a template</w:t>
-      </w:r>
-      <w:r>
-        <w:rPr>
-          <w:rFonts w:ascii="Arial" w:hAnsi="Arial"/>
-          <w:sz w:val="20"/>
-          <w:szCs w:val="20"/>
-        </w:rPr>
-        <w:t>.</w:t>
-      </w:r>
-      <w:r>
-        <w:rPr>
-          <w:rFonts w:ascii="Arial" w:hAnsi="Arial"/>
-          <w:sz w:val="20"/>
-          <w:szCs w:val="20"/>
-        </w:rPr>
-        <w:t>&gt;</w:t>
-      </w:r>
-    </w:p>
-    <w:p>
-      <w:pPr>
-        <w:rPr>
-          <w:rFonts w:ascii="Arial" w:hAnsi="Arial"/>
-          <w:b/>
-          <w:bCs/>
-        </w:rPr>
-      </w:pPr>
+          <w:b/>
+          <w:bCs/>
+        </w:rPr>
+      </w:pPr>
+      <w:r>
+        <w:rPr>
+          <w:noProof/>
+        </w:rPr>
+        <w:drawing>
+          <wp:inline distT="0" distB="0" distL="0" distR="0" wp14:anchorId="571C5D9D" wp14:editId="7AFF5317">
+            <wp:extent cx="3009265" cy="1817370"/>
+            <wp:effectExtent l="0" t="0" r="635" b="0"/>
+            <wp:docPr id="2056507586" name="Picture 1"/>
+            <wp:cNvGraphicFramePr>
+              <a:graphicFrameLocks xmlns:a="http://schemas.openxmlformats.org/drawingml/2006/main" noChangeAspect="1"/>
+            </wp:cNvGraphicFramePr>
+            <a:graphic xmlns:a="http://schemas.openxmlformats.org/drawingml/2006/main">
+              <a:graphicData uri="http://schemas.openxmlformats.org/drawingml/2006/picture">
+                <pic:pic xmlns:pic="http://schemas.openxmlformats.org/drawingml/2006/picture">
+                  <pic:nvPicPr>
+                    <pic:cNvPr id="0" name="Picture 1"/>
+                    <pic:cNvPicPr>
+                      <a:picLocks noChangeAspect="1" noChangeArrowheads="1"/>
+                    </pic:cNvPicPr>
+                  </pic:nvPicPr>
+                  <pic:blipFill>
+                    <a:blip r:embed="rId4">
+                      <a:extLst>
+                        <a:ext uri="{28A0092B-C50C-407E-A947-70E740481C1C}">
+                          <a14:useLocalDpi xmlns:a14="http://schemas.microsoft.com/office/drawing/2010/main" val="0"/>
+                        </a:ext>
+                      </a:extLst>
+                    </a:blip>
+                    <a:srcRect/>
+                    <a:stretch>
+                      <a:fillRect/>
+                    </a:stretch>
+                  </pic:blipFill>
+                  <pic:spPr bwMode="auto">
+                    <a:xfrm>
+                      <a:off x="0" y="0"/>
+                      <a:ext cx="3009265" cy="1817370"/>
+                    </a:xfrm>
+                    <a:prstGeom prst="rect">
+                      <a:avLst/>
+                    </a:prstGeom>
+                    <a:noFill/>
+                    <a:ln>
+                      <a:noFill/>
+                    </a:ln>
+                  </pic:spPr>
+                </pic:pic>
+              </a:graphicData>
+            </a:graphic>
+          </wp:inline>
+        </w:drawing>
+      </w:r>
     </w:p>
     <w:p>
       <w:pPr>
@@ -305,7 +262,15 @@
           <w:b/>
           <w:bCs/>
         </w:rPr>
-        <w:t>2</w:t>
+        <w:t xml:space="preserve">2 </w:t>
+      </w:r>
+      <w:r>
+        <w:rPr>
+          <w:rFonts w:ascii="Arial" w:hAnsi="Arial"/>
+          <w:b/>
+          <w:bCs/>
+        </w:rPr>
+        <w:t>–</w:t>
       </w:r>
       <w:r>
         <w:rPr>
@@ -321,6 +286,150 @@
           <w:b/>
           <w:bCs/>
         </w:rPr>
+        <w:t>validate</w:t>
+      </w:r>
+      <w:r>
+        <w:rPr>
+          <w:rFonts w:ascii="Arial" w:hAnsi="Arial"/>
+          <w:b/>
+          <w:bCs/>
+        </w:rPr>
+        <w:t>()</w:t>
+      </w:r>
+    </w:p>
+    <w:p>
+      <w:pPr>
+        <w:rPr>
+          <w:rFonts w:ascii="Arial" w:hAnsi="Arial"/>
+          <w:b/>
+          <w:bCs/>
+        </w:rPr>
+      </w:pPr>
+    </w:p>
+    <w:p>
+      <w:pPr>
+        <w:rPr>
+          <w:rFonts w:ascii="Arial" w:hAnsi="Arial"/>
+          <w:b/>
+          <w:bCs/>
+        </w:rPr>
+      </w:pPr>
+      <w:r>
+        <w:rPr>
+          <w:noProof/>
+        </w:rPr>
+        <w:drawing>
+          <wp:inline distT="0" distB="0" distL="0" distR="0" wp14:anchorId="32823893" wp14:editId="2514FE72">
+            <wp:extent cx="2286000" cy="2199005"/>
+            <wp:effectExtent l="0" t="0" r="0" b="0"/>
+            <wp:docPr id="1201621531" name="Picture 2"/>
+            <wp:cNvGraphicFramePr>
+              <a:graphicFrameLocks xmlns:a="http://schemas.openxmlformats.org/drawingml/2006/main" noChangeAspect="1"/>
+            </wp:cNvGraphicFramePr>
+            <a:graphic xmlns:a="http://schemas.openxmlformats.org/drawingml/2006/main">
+              <a:graphicData uri="http://schemas.openxmlformats.org/drawingml/2006/picture">
+                <pic:pic xmlns:pic="http://schemas.openxmlformats.org/drawingml/2006/picture">
+                  <pic:nvPicPr>
+                    <pic:cNvPr id="0" name="Picture 3"/>
+                    <pic:cNvPicPr>
+                      <a:picLocks noChangeAspect="1" noChangeArrowheads="1"/>
+                    </pic:cNvPicPr>
+                  </pic:nvPicPr>
+                  <pic:blipFill>
+                    <a:blip r:embed="rId5">
+                      <a:extLst>
+                        <a:ext uri="{28A0092B-C50C-407E-A947-70E740481C1C}">
+                          <a14:useLocalDpi xmlns:a14="http://schemas.microsoft.com/office/drawing/2010/main" val="0"/>
+                        </a:ext>
+                      </a:extLst>
+                    </a:blip>
+                    <a:srcRect/>
+                    <a:stretch>
+                      <a:fillRect/>
+                    </a:stretch>
+                  </pic:blipFill>
+                  <pic:spPr bwMode="auto">
+                    <a:xfrm>
+                      <a:off x="0" y="0"/>
+                      <a:ext cx="2286000" cy="2199005"/>
+                    </a:xfrm>
+                    <a:prstGeom prst="rect">
+                      <a:avLst/>
+                    </a:prstGeom>
+                    <a:noFill/>
+                    <a:ln>
+                      <a:noFill/>
+                    </a:ln>
+                  </pic:spPr>
+                </pic:pic>
+              </a:graphicData>
+            </a:graphic>
+          </wp:inline>
+        </w:drawing>
+      </w:r>
+    </w:p>
+    <w:p>
+      <w:pPr>
+        <w:rPr>
+          <w:rFonts w:ascii="Arial" w:hAnsi="Arial"/>
+          <w:b/>
+          <w:bCs/>
+        </w:rPr>
+      </w:pPr>
+      <w:r>
+        <w:rPr>
+          <w:rFonts w:ascii="Arial" w:hAnsi="Arial"/>
+          <w:b/>
+          <w:bCs/>
+        </w:rPr>
+        <w:t>SC</w:t>
+      </w:r>
+      <w:r>
+        <w:rPr>
+          <w:rFonts w:ascii="Arial" w:hAnsi="Arial"/>
+          <w:b/>
+          <w:bCs/>
+        </w:rPr>
+        <w:t xml:space="preserve"> </w:t>
+      </w:r>
+      <w:r>
+        <w:rPr>
+          <w:rFonts w:ascii="Arial" w:hAnsi="Arial"/>
+          <w:b/>
+          <w:bCs/>
+        </w:rPr>
+        <w:t>Figure 1.</w:t>
+      </w:r>
+      <w:r>
+        <w:rPr>
+          <w:rFonts w:ascii="Arial" w:hAnsi="Arial"/>
+          <w:b/>
+          <w:bCs/>
+        </w:rPr>
+        <w:t>8</w:t>
+      </w:r>
+      <w:r>
+        <w:rPr>
+          <w:rFonts w:ascii="Arial" w:hAnsi="Arial"/>
+          <w:b/>
+          <w:bCs/>
+        </w:rPr>
+        <w:t>.0.</w:t>
+      </w:r>
+      <w:r>
+        <w:rPr>
+          <w:rFonts w:ascii="Arial" w:hAnsi="Arial"/>
+          <w:b/>
+          <w:bCs/>
+        </w:rPr>
+        <w:t xml:space="preserve">3 </w:t>
+      </w:r>
+      <w:r>
+        <w:rPr>
+          <w:rFonts w:ascii="Arial" w:hAnsi="Arial"/>
+          <w:b/>
+          <w:bCs/>
+        </w:rPr>
         <w:t>–</w:t>
       </w:r>
       <w:r>
@@ -331,16 +440,14 @@
         </w:rPr>
         <w:t xml:space="preserve"> </w:t>
       </w:r>
-      <w:proofErr w:type="spellStart"/>
-      <w:r>
-        <w:rPr>
-          <w:rFonts w:ascii="Arial" w:hAnsi="Arial"/>
-          <w:b/>
-          <w:bCs/>
-        </w:rPr>
-        <w:t>theNameOfTheFunctionBeingCharted</w:t>
-      </w:r>
-      <w:proofErr w:type="spellEnd"/>
+      <w:r>
+        <w:rPr>
+          <w:rFonts w:ascii="Arial" w:hAnsi="Arial"/>
+          <w:b/>
+          <w:bCs/>
+        </w:rPr>
+        <w:t>modifyPost</w:t>
+      </w:r>
       <w:r>
         <w:rPr>
           <w:rFonts w:ascii="Arial" w:hAnsi="Arial"/>
@@ -363,79 +470,97 @@
       <w:pPr>
         <w:rPr>
           <w:rFonts w:ascii="Arial" w:hAnsi="Arial"/>
-          <w:sz w:val="20"/>
-          <w:szCs w:val="20"/>
-        </w:rPr>
-      </w:pPr>
-      <w:r>
-        <w:rPr>
-          <w:rFonts w:ascii="Arial" w:hAnsi="Arial"/>
-          <w:sz w:val="20"/>
-          <w:szCs w:val="20"/>
-        </w:rPr>
-        <w:t xml:space="preserve">&lt;Diagram Goes Here. Load the </w:t>
-      </w:r>
-      <w:proofErr w:type="spellStart"/>
-      <w:r>
-        <w:rPr>
-          <w:rFonts w:ascii="Arial" w:hAnsi="Arial"/>
-          <w:sz w:val="20"/>
-          <w:szCs w:val="20"/>
-        </w:rPr>
-        <w:t>sc.drawio</w:t>
-      </w:r>
-      <w:proofErr w:type="spellEnd"/>
-      <w:r>
-        <w:rPr>
-          <w:rFonts w:ascii="Arial" w:hAnsi="Arial"/>
-          <w:sz w:val="20"/>
-          <w:szCs w:val="20"/>
-        </w:rPr>
-        <w:t xml:space="preserve"> file in the /Reference folder into </w:t>
-      </w:r>
-      <w:hyperlink r:id="rId5" w:history="1">
-        <w:r>
-          <w:rPr>
-            <w:rStyle w:val="Hyperlink"/>
-            <w:rFonts w:ascii="Arial" w:hAnsi="Arial"/>
-            <w:sz w:val="20"/>
-            <w:szCs w:val="20"/>
-          </w:rPr>
-          <w:t>https://app.diagrams.net/</w:t>
-        </w:r>
-      </w:hyperlink>
-      <w:r>
-        <w:rPr>
-          <w:rFonts w:ascii="Arial" w:hAnsi="Arial"/>
-          <w:sz w:val="20"/>
-          <w:szCs w:val="20"/>
-        </w:rPr>
-        <w:t xml:space="preserve"> to use as a template.&gt;</w:t>
-      </w:r>
-    </w:p>
-    <w:p>
-      <w:pPr>
-        <w:rPr>
-          <w:rFonts w:ascii="Arial" w:hAnsi="Arial"/>
-          <w:b/>
-          <w:bCs/>
-        </w:rPr>
-      </w:pPr>
-    </w:p>
-    <w:p>
-      <w:pPr>
-        <w:rPr>
-          <w:rFonts w:ascii="Arial" w:hAnsi="Arial"/>
-          <w:b/>
-          <w:bCs/>
-        </w:rPr>
-      </w:pPr>
-      <w:r>
-        <w:rPr>
-          <w:rFonts w:ascii="Arial" w:hAnsi="Arial"/>
-          <w:b/>
-          <w:bCs/>
-        </w:rPr>
+          <w:b/>
+          <w:bCs/>
+        </w:rPr>
+      </w:pPr>
+      <w:r>
+        <w:rPr>
+          <w:noProof/>
+        </w:rPr>
+        <w:drawing>
+          <wp:inline distT="0" distB="0" distL="0" distR="0" wp14:anchorId="166E6659" wp14:editId="5E68092A">
+            <wp:extent cx="3079115" cy="2517775"/>
+            <wp:effectExtent l="0" t="0" r="6985" b="0"/>
+            <wp:docPr id="1990278998" name="Picture 3"/>
+            <wp:cNvGraphicFramePr>
+              <a:graphicFrameLocks xmlns:a="http://schemas.openxmlformats.org/drawingml/2006/main" noChangeAspect="1"/>
+            </wp:cNvGraphicFramePr>
+            <a:graphic xmlns:a="http://schemas.openxmlformats.org/drawingml/2006/main">
+              <a:graphicData uri="http://schemas.openxmlformats.org/drawingml/2006/picture">
+                <pic:pic xmlns:pic="http://schemas.openxmlformats.org/drawingml/2006/picture">
+                  <pic:nvPicPr>
+                    <pic:cNvPr id="0" name="Picture 5"/>
+                    <pic:cNvPicPr>
+                      <a:picLocks noChangeAspect="1" noChangeArrowheads="1"/>
+                    </pic:cNvPicPr>
+                  </pic:nvPicPr>
+                  <pic:blipFill>
+                    <a:blip r:embed="rId6">
+                      <a:extLst>
+                        <a:ext uri="{28A0092B-C50C-407E-A947-70E740481C1C}">
+                          <a14:useLocalDpi xmlns:a14="http://schemas.microsoft.com/office/drawing/2010/main" val="0"/>
+                        </a:ext>
+                      </a:extLst>
+                    </a:blip>
+                    <a:srcRect/>
+                    <a:stretch>
+                      <a:fillRect/>
+                    </a:stretch>
+                  </pic:blipFill>
+                  <pic:spPr bwMode="auto">
+                    <a:xfrm>
+                      <a:off x="0" y="0"/>
+                      <a:ext cx="3079115" cy="2517775"/>
+                    </a:xfrm>
+                    <a:prstGeom prst="rect">
+                      <a:avLst/>
+                    </a:prstGeom>
+                    <a:noFill/>
+                    <a:ln>
+                      <a:noFill/>
+                    </a:ln>
+                  </pic:spPr>
+                </pic:pic>
+              </a:graphicData>
+            </a:graphic>
+          </wp:inline>
+        </w:drawing>
+      </w:r>
+    </w:p>
+    <w:p>
+      <w:pPr>
+        <w:rPr>
+          <w:rFonts w:ascii="Arial" w:hAnsi="Arial"/>
+          <w:b/>
+          <w:bCs/>
+        </w:rPr>
+      </w:pPr>
+    </w:p>
+    <w:p>
+      <w:pPr>
+        <w:rPr>
+          <w:rFonts w:ascii="Arial" w:hAnsi="Arial"/>
+          <w:b/>
+          <w:bCs/>
+        </w:rPr>
+      </w:pPr>
+    </w:p>
+    <w:p>
+      <w:pPr>
+        <w:rPr>
+          <w:rFonts w:ascii="Arial" w:hAnsi="Arial"/>
+          <w:b/>
+          <w:bCs/>
+        </w:rPr>
+      </w:pPr>
+      <w:r>
+        <w:rPr>
+          <w:rFonts w:ascii="Arial" w:hAnsi="Arial"/>
+          <w:b/>
+          <w:bCs/>
+        </w:rPr>
+        <w:lastRenderedPageBreak/>
         <w:t>SC</w:t>
       </w:r>
       <w:r>
@@ -476,15 +601,7 @@
           <w:b/>
           <w:bCs/>
         </w:rPr>
-        <w:t>3</w:t>
-      </w:r>
-      <w:r>
-        <w:rPr>
-          <w:rFonts w:ascii="Arial" w:hAnsi="Arial"/>
-          <w:b/>
-          <w:bCs/>
-        </w:rPr>
-        <w:t xml:space="preserve"> </w:t>
+        <w:t xml:space="preserve">4 </w:t>
       </w:r>
       <w:r>
         <w:rPr>
@@ -500,269 +617,79 @@
           <w:b/>
           <w:bCs/>
         </w:rPr>
-        <w:t xml:space="preserve"> </w:t>
-      </w:r>
-      <w:proofErr w:type="spellStart"/>
-      <w:r>
-        <w:rPr>
-          <w:rFonts w:ascii="Arial" w:hAnsi="Arial"/>
-          <w:b/>
-          <w:bCs/>
-        </w:rPr>
-        <w:t>theNameOfTheFunctionBeingCharted</w:t>
-      </w:r>
-      <w:proofErr w:type="spellEnd"/>
-      <w:r>
-        <w:rPr>
-          <w:rFonts w:ascii="Arial" w:hAnsi="Arial"/>
-          <w:b/>
-          <w:bCs/>
-        </w:rPr>
-        <w:t>()</w:t>
-      </w:r>
-    </w:p>
-    <w:p>
-      <w:pPr>
-        <w:rPr>
-          <w:rFonts w:ascii="Arial" w:hAnsi="Arial"/>
-          <w:b/>
-          <w:bCs/>
-        </w:rPr>
-      </w:pPr>
-    </w:p>
-    <w:p>
-      <w:pPr>
-        <w:rPr>
-          <w:rFonts w:ascii="Arial" w:hAnsi="Arial"/>
-          <w:sz w:val="20"/>
-          <w:szCs w:val="20"/>
-        </w:rPr>
-      </w:pPr>
-      <w:r>
-        <w:rPr>
-          <w:rFonts w:ascii="Arial" w:hAnsi="Arial"/>
-          <w:sz w:val="20"/>
-          <w:szCs w:val="20"/>
-        </w:rPr>
-        <w:t xml:space="preserve">&lt;Diagram Goes Here. Load the </w:t>
-      </w:r>
-      <w:proofErr w:type="spellStart"/>
-      <w:r>
-        <w:rPr>
-          <w:rFonts w:ascii="Arial" w:hAnsi="Arial"/>
-          <w:sz w:val="20"/>
-          <w:szCs w:val="20"/>
-        </w:rPr>
-        <w:t>sc.drawio</w:t>
-      </w:r>
-      <w:proofErr w:type="spellEnd"/>
-      <w:r>
-        <w:rPr>
-          <w:rFonts w:ascii="Arial" w:hAnsi="Arial"/>
-          <w:sz w:val="20"/>
-          <w:szCs w:val="20"/>
-        </w:rPr>
-        <w:t xml:space="preserve"> file in the /Reference folder into </w:t>
-      </w:r>
-      <w:hyperlink r:id="rId6" w:history="1">
-        <w:r>
-          <w:rPr>
-            <w:rStyle w:val="Hyperlink"/>
-            <w:rFonts w:ascii="Arial" w:hAnsi="Arial"/>
-            <w:sz w:val="20"/>
-            <w:szCs w:val="20"/>
-          </w:rPr>
-          <w:t>https://app.diagrams.net/</w:t>
-        </w:r>
-      </w:hyperlink>
-      <w:r>
-        <w:rPr>
-          <w:rFonts w:ascii="Arial" w:hAnsi="Arial"/>
-          <w:sz w:val="20"/>
-          <w:szCs w:val="20"/>
-        </w:rPr>
-        <w:t xml:space="preserve"> to use as a template.&gt;</w:t>
-      </w:r>
-    </w:p>
-    <w:p>
-      <w:pPr>
-        <w:rPr>
-          <w:rFonts w:ascii="Arial" w:hAnsi="Arial"/>
-          <w:b/>
-          <w:bCs/>
-        </w:rPr>
-      </w:pPr>
-    </w:p>
-    <w:p>
-      <w:pPr>
-        <w:rPr>
-          <w:rFonts w:ascii="Arial" w:hAnsi="Arial"/>
-          <w:b/>
-          <w:bCs/>
-        </w:rPr>
-      </w:pPr>
-      <w:r>
-        <w:rPr>
-          <w:rFonts w:ascii="Arial" w:hAnsi="Arial"/>
-          <w:b/>
-          <w:bCs/>
-        </w:rPr>
-        <w:t>SC</w:t>
-      </w:r>
-      <w:r>
-        <w:rPr>
-          <w:rFonts w:ascii="Arial" w:hAnsi="Arial"/>
-          <w:b/>
-          <w:bCs/>
-        </w:rPr>
-        <w:t xml:space="preserve"> </w:t>
-      </w:r>
-      <w:r>
-        <w:rPr>
-          <w:rFonts w:ascii="Arial" w:hAnsi="Arial"/>
-          <w:b/>
-          <w:bCs/>
-        </w:rPr>
-        <w:t>Figure 1.</w:t>
-      </w:r>
-      <w:r>
-        <w:rPr>
-          <w:rFonts w:ascii="Arial" w:hAnsi="Arial"/>
-          <w:b/>
-          <w:bCs/>
-        </w:rPr>
-        <w:t>8</w:t>
-      </w:r>
-      <w:r>
-        <w:rPr>
-          <w:rFonts w:ascii="Arial" w:hAnsi="Arial"/>
-          <w:b/>
-          <w:bCs/>
-        </w:rPr>
-        <w:t>.0.</w:t>
-      </w:r>
-      <w:r>
-        <w:rPr>
-          <w:rFonts w:ascii="Arial" w:hAnsi="Arial"/>
-          <w:b/>
-          <w:bCs/>
-        </w:rPr>
-        <w:t>4</w:t>
-      </w:r>
-      <w:r>
-        <w:rPr>
-          <w:rFonts w:ascii="Arial" w:hAnsi="Arial"/>
-          <w:b/>
-          <w:bCs/>
-        </w:rPr>
-        <w:t xml:space="preserve"> </w:t>
-      </w:r>
-      <w:r>
-        <w:rPr>
-          <w:rFonts w:ascii="Arial" w:hAnsi="Arial"/>
-          <w:b/>
-          <w:bCs/>
-        </w:rPr>
-        <w:t>–</w:t>
-      </w:r>
-      <w:r>
-        <w:rPr>
-          <w:rFonts w:ascii="Arial" w:hAnsi="Arial"/>
-          <w:b/>
-          <w:bCs/>
-        </w:rPr>
-        <w:t xml:space="preserve"> </w:t>
-      </w:r>
-      <w:proofErr w:type="spellStart"/>
-      <w:r>
-        <w:rPr>
-          <w:rFonts w:ascii="Arial" w:hAnsi="Arial"/>
-          <w:b/>
-          <w:bCs/>
-        </w:rPr>
-        <w:t>theNameOfTheFunctionBeingCharted</w:t>
-      </w:r>
-      <w:proofErr w:type="spellEnd"/>
-      <w:r>
-        <w:rPr>
-          <w:rFonts w:ascii="Arial" w:hAnsi="Arial"/>
-          <w:b/>
-          <w:bCs/>
-        </w:rPr>
-        <w:t>()</w:t>
-      </w:r>
-    </w:p>
-    <w:p>
-      <w:pPr>
-        <w:rPr>
-          <w:rFonts w:ascii="Arial" w:hAnsi="Arial"/>
-          <w:b/>
-          <w:bCs/>
-        </w:rPr>
-      </w:pPr>
-    </w:p>
-    <w:p>
-      <w:pPr>
-        <w:rPr>
-          <w:rFonts w:ascii="Arial" w:hAnsi="Arial"/>
-          <w:sz w:val="20"/>
-          <w:szCs w:val="20"/>
-        </w:rPr>
-      </w:pPr>
-      <w:r>
-        <w:rPr>
-          <w:rFonts w:ascii="Arial" w:hAnsi="Arial"/>
-          <w:sz w:val="20"/>
-          <w:szCs w:val="20"/>
-        </w:rPr>
-        <w:t xml:space="preserve">&lt;Diagram Goes Here. Load the </w:t>
-      </w:r>
-      <w:proofErr w:type="spellStart"/>
-      <w:r>
-        <w:rPr>
-          <w:rFonts w:ascii="Arial" w:hAnsi="Arial"/>
-          <w:sz w:val="20"/>
-          <w:szCs w:val="20"/>
-        </w:rPr>
-        <w:t>sc.drawio</w:t>
-      </w:r>
-      <w:proofErr w:type="spellEnd"/>
-      <w:r>
-        <w:rPr>
-          <w:rFonts w:ascii="Arial" w:hAnsi="Arial"/>
-          <w:sz w:val="20"/>
-          <w:szCs w:val="20"/>
-        </w:rPr>
-        <w:t xml:space="preserve"> file in the /Reference folder into </w:t>
-      </w:r>
-      <w:hyperlink r:id="rId7" w:history="1">
-        <w:r>
-          <w:rPr>
-            <w:rStyle w:val="Hyperlink"/>
-            <w:rFonts w:ascii="Arial" w:hAnsi="Arial"/>
-            <w:sz w:val="20"/>
-            <w:szCs w:val="20"/>
-          </w:rPr>
-          <w:t>https://app.diagrams.net/</w:t>
-        </w:r>
-      </w:hyperlink>
-      <w:r>
-        <w:rPr>
-          <w:rFonts w:ascii="Arial" w:hAnsi="Arial"/>
-          <w:sz w:val="20"/>
-          <w:szCs w:val="20"/>
-        </w:rPr>
-        <w:t xml:space="preserve"> to use as a template.&gt;</w:t>
-      </w:r>
-    </w:p>
-    <w:p>
-      <w:pPr>
-        <w:rPr>
-          <w:rFonts w:ascii="Arial" w:hAnsi="Arial"/>
-          <w:b/>
-          <w:bCs/>
-        </w:rPr>
-      </w:pPr>
+        <w:t xml:space="preserve"> theNameOfTheFunctionBeingCharted()</w:t>
+      </w:r>
+    </w:p>
+    <w:p>
+      <w:pPr>
+        <w:rPr>
+          <w:rFonts w:ascii="Arial" w:hAnsi="Arial"/>
+          <w:b/>
+          <w:bCs/>
+        </w:rPr>
+      </w:pPr>
+    </w:p>
+    <w:p>
+      <w:pPr>
+        <w:rPr>
+          <w:rFonts w:ascii="Arial" w:hAnsi="Arial"/>
+          <w:b/>
+          <w:bCs/>
+        </w:rPr>
+      </w:pPr>
+      <w:r>
+        <w:rPr>
+          <w:noProof/>
+        </w:rPr>
+        <w:drawing>
+          <wp:inline distT="0" distB="0" distL="0" distR="0" wp14:anchorId="5ECBE5E4" wp14:editId="0127B6B1">
+            <wp:extent cx="2390140" cy="2019935"/>
+            <wp:effectExtent l="0" t="0" r="0" b="0"/>
+            <wp:docPr id="745293787" name="Picture 4"/>
+            <wp:cNvGraphicFramePr>
+              <a:graphicFrameLocks xmlns:a="http://schemas.openxmlformats.org/drawingml/2006/main" noChangeAspect="1"/>
+            </wp:cNvGraphicFramePr>
+            <a:graphic xmlns:a="http://schemas.openxmlformats.org/drawingml/2006/main">
+              <a:graphicData uri="http://schemas.openxmlformats.org/drawingml/2006/picture">
+                <pic:pic xmlns:pic="http://schemas.openxmlformats.org/drawingml/2006/picture">
+                  <pic:nvPicPr>
+                    <pic:cNvPr id="0" name="Picture 7"/>
+                    <pic:cNvPicPr>
+                      <a:picLocks noChangeAspect="1" noChangeArrowheads="1"/>
+                    </pic:cNvPicPr>
+                  </pic:nvPicPr>
+                  <pic:blipFill>
+                    <a:blip r:embed="rId7">
+                      <a:extLst>
+                        <a:ext uri="{28A0092B-C50C-407E-A947-70E740481C1C}">
+                          <a14:useLocalDpi xmlns:a14="http://schemas.microsoft.com/office/drawing/2010/main" val="0"/>
+                        </a:ext>
+                      </a:extLst>
+                    </a:blip>
+                    <a:srcRect/>
+                    <a:stretch>
+                      <a:fillRect/>
+                    </a:stretch>
+                  </pic:blipFill>
+                  <pic:spPr bwMode="auto">
+                    <a:xfrm>
+                      <a:off x="0" y="0"/>
+                      <a:ext cx="2390140" cy="2019935"/>
+                    </a:xfrm>
+                    <a:prstGeom prst="rect">
+                      <a:avLst/>
+                    </a:prstGeom>
+                    <a:noFill/>
+                    <a:ln>
+                      <a:noFill/>
+                    </a:ln>
+                  </pic:spPr>
+                </pic:pic>
+              </a:graphicData>
+            </a:graphic>
+          </wp:inline>
+        </w:drawing>
+      </w:r>
     </w:p>
     <w:sectPr>
       <w:pgSz w:w="12240" w:h="15840"/>

</xml_diff>

<commit_message>
update JobPostingService SC function name
</commit_message>
<xml_diff>
--- a/03_Team_Work/Team1/Milestone_3_Components/Part2/1_In_Progress/DC_M3_Team1_SC_JobPostingService_v1.0.docx
+++ b/03_Team_Work/Team1/Milestone_3_Components/Part2/1_In_Progress/DC_M3_Team1_SC_JobPostingService_v1.0.docx
@@ -617,7 +617,23 @@
           <w:b/>
           <w:bCs/>
         </w:rPr>
-        <w:t xml:space="preserve"> theNameOfTheFunctionBeingCharted()</w:t>
+        <w:t xml:space="preserve"> </w:t>
+      </w:r>
+      <w:r>
+        <w:rPr>
+          <w:rFonts w:ascii="Arial" w:hAnsi="Arial"/>
+          <w:b/>
+          <w:bCs/>
+        </w:rPr>
+        <w:t>isAuthorized</w:t>
+      </w:r>
+      <w:r>
+        <w:rPr>
+          <w:rFonts w:ascii="Arial" w:hAnsi="Arial"/>
+          <w:b/>
+          <w:bCs/>
+        </w:rPr>
+        <w:t>()</w:t>
       </w:r>
     </w:p>
     <w:p>

</xml_diff>